<commit_message>
chore(plan-trabajo): actualizar plantilla docx Nexa
Actualización manual de la plantilla base (plan-trabajo-nexa-template.docx)
usada por descargarPlantilla.ts / exportDocx.ts.
</commit_message>
<xml_diff>
--- a/src/lib/services/planTrabajo/templates/plan-trabajo-nexa-template.docx
+++ b/src/lib/services/planTrabajo/templates/plan-trabajo-nexa-template.docx
@@ -819,19 +819,65 @@
           </w:tcPr>
           <w:p>
             <w:pPr>
-              <w:spacing w:after="120" w:before="0"/>
-            </w:pPr>
-            <w:r>
-              <w:rPr>
-                <w:rFonts w:ascii="Arial" w:cs="Arial" w:eastAsia="Arial" w:hAnsi="Arial"/>
-                <w:b w:val="false"/>
-                <w:bCs w:val="false"/>
-                <w:i w:val="false"/>
-                <w:iCs w:val="false"/>
-                <w:sz w:val="20"/>
-                <w:szCs w:val="20"/>
-              </w:rPr>
-              <w:t xml:space="preserve">{#firmantes}{siglas}: {nombre}{/firmantes}</w:t>
+              <w:spacing w:after="0" w:before="0"/>
+            </w:pPr>
+            <w:r>
+              <w:rPr>
+                <w:rFonts w:ascii="Arial" w:cs="Arial" w:eastAsia="Arial" w:hAnsi="Arial"/>
+                <w:b w:val="false"/>
+                <w:bCs w:val="false"/>
+                <w:i w:val="false"/>
+                <w:iCs w:val="false"/>
+                <w:sz w:val="20"/>
+                <w:szCs w:val="20"/>
+              </w:rPr>
+              <w:t xml:space="preserve">{#firmantes}</w:t>
+            </w:r>
+          </w:p>
+          <w:p>
+            <w:pPr>
+              <w:spacing w:after="0" w:before="0"/>
+            </w:pPr>
+            <w:r>
+              <w:rPr>
+                <w:rFonts w:ascii="Arial" w:cs="Arial" w:eastAsia="Arial" w:hAnsi="Arial"/>
+                <w:b/>
+                <w:bCs/>
+                <w:i w:val="false"/>
+                <w:iCs w:val="false"/>
+                <w:sz w:val="20"/>
+                <w:szCs w:val="20"/>
+              </w:rPr>
+              <w:t xml:space="preserve">{siglas}: </w:t>
+            </w:r>
+            <w:r>
+              <w:rPr>
+                <w:rFonts w:ascii="Arial" w:cs="Arial" w:eastAsia="Arial" w:hAnsi="Arial"/>
+                <w:b w:val="false"/>
+                <w:bCs w:val="false"/>
+                <w:i w:val="false"/>
+                <w:iCs w:val="false"/>
+                <w:sz w:val="20"/>
+                <w:szCs w:val="20"/>
+              </w:rPr>
+              <w:t xml:space="preserve">{nombre}</w:t>
+            </w:r>
+          </w:p>
+          <w:p>
+            <w:pPr>
+              <w:spacing w:after="0" w:before="0"/>
+            </w:pPr>
+            <w:r>
+              <w:rPr>
+                <w:rFonts w:ascii="Arial" w:cs="Arial" w:eastAsia="Arial" w:hAnsi="Arial"/>
+                <w:b w:val="false"/>
+                <w:bCs w:val="false"/>
+                <w:i w:val="false"/>
+                <w:iCs w:val="false"/>
+                <w:sz w:val="20"/>
+                <w:szCs w:val="20"/>
+              </w:rPr>
+              <w:t xml:space="preserve">{/firmantes}</w:t>
             </w:r>
           </w:p>
         </w:tc>
@@ -4519,6 +4565,76 @@
           <w:szCs w:val="20"/>
         </w:rPr>
         <w:t xml:space="preserve">{/personalRequerido}</w:t>
+      </w:r>
+    </w:p>
+    <w:p>
+      <w:pPr>
+        <w:spacing w:after="0" w:before="0"/>
+      </w:pPr>
+      <w:r>
+        <w:rPr>
+          <w:rFonts w:ascii="Arial" w:cs="Arial" w:eastAsia="Arial" w:hAnsi="Arial"/>
+          <w:b w:val="false"/>
+          <w:bCs w:val="false"/>
+          <w:i w:val="false"/>
+          <w:iCs w:val="false"/>
+          <w:sz w:val="20"/>
+          <w:szCs w:val="20"/>
+        </w:rPr>
+        <w:t xml:space="preserve">{#imagenes}</w:t>
+      </w:r>
+    </w:p>
+    <w:p>
+      <w:pPr>
+        <w:spacing w:after="120" w:before="0"/>
+        <w:jc w:val="center"/>
+      </w:pPr>
+      <w:r>
+        <w:rPr>
+          <w:rFonts w:ascii="Arial" w:cs="Arial" w:eastAsia="Arial" w:hAnsi="Arial"/>
+          <w:b w:val="false"/>
+          <w:bCs w:val="false"/>
+          <w:i w:val="false"/>
+          <w:iCs w:val="false"/>
+          <w:sz w:val="20"/>
+          <w:szCs w:val="20"/>
+        </w:rPr>
+        <w:t xml:space="preserve">{%img}</w:t>
+      </w:r>
+    </w:p>
+    <w:p>
+      <w:pPr>
+        <w:spacing w:after="120" w:before="0"/>
+        <w:jc w:val="center"/>
+      </w:pPr>
+      <w:r>
+        <w:rPr>
+          <w:rFonts w:ascii="Arial" w:cs="Arial" w:eastAsia="Arial" w:hAnsi="Arial"/>
+          <w:b w:val="false"/>
+          <w:bCs w:val="false"/>
+          <w:i/>
+          <w:iCs/>
+          <w:sz w:val="18"/>
+          <w:szCs w:val="18"/>
+        </w:rPr>
+        <w:t xml:space="preserve">{caption}</w:t>
+      </w:r>
+    </w:p>
+    <w:p>
+      <w:pPr>
+        <w:spacing w:after="0" w:before="0"/>
+      </w:pPr>
+      <w:r>
+        <w:rPr>
+          <w:rFonts w:ascii="Arial" w:cs="Arial" w:eastAsia="Arial" w:hAnsi="Arial"/>
+          <w:b w:val="false"/>
+          <w:bCs w:val="false"/>
+          <w:i w:val="false"/>
+          <w:iCs w:val="false"/>
+          <w:sz w:val="20"/>
+          <w:szCs w:val="20"/>
+        </w:rPr>
+        <w:t xml:space="preserve">{/imagenes}</w:t>
       </w:r>
     </w:p>
     <w:p>

</xml_diff>

<commit_message>
feat(plan-trabajo): plantilla v4 (tareas + graficos histograma) y restaurar export
Reemplaza plan-trabajo-nexa-template.docx por la v4: agrega dentro de
{#subItems} un loop de tareas {#tareas}{texto}{/tareas} (vinetas, entre
descripcion e imagenes) y en la seccion 13 los condicionales de grafico
{#tieneHistogramaEquipoPng}{%histogramaEquipoPng}{/...} /
{#tieneHistogramaHHPng}{%histogramaHHPng}{/...} encima de cada tabla.

construirDataBag.ts alimenta las claves nuevas para no romper el nullGetter
estricto: tareas: [] por subItem (el builder/IA las puebla en la Tarea 4 de
este mismo bloque) y tieneHistograma*Png: false + IMAGEN_PLACEHOLDER (la
Tarea 3 los reemplaza por los PNG reales; el flag en false evita que
docxtemplater renderice el bloque condicional mientras tanto).

Co-Authored-By: Claude Sonnet 5 <noreply@anthropic.com>
</commit_message>
<xml_diff>
--- a/src/lib/services/planTrabajo/templates/plan-trabajo-nexa-template.docx
+++ b/src/lib/services/planTrabajo/templates/plan-trabajo-nexa-template.docx
@@ -4508,24 +4508,7 @@
           <w:sz w:val="20"/>
           <w:szCs w:val="20"/>
         </w:rPr>
-        <w:t xml:space="preserve">{/subItems}</w:t>
-      </w:r>
-    </w:p>
-    <w:p>
-      <w:pPr>
-        <w:spacing w:after="0" w:before="0"/>
-      </w:pPr>
-      <w:r>
-        <w:rPr>
-          <w:rFonts w:ascii="Arial" w:cs="Arial" w:eastAsia="Arial" w:hAnsi="Arial"/>
-          <w:b w:val="false"/>
-          <w:bCs w:val="false"/>
-          <w:i w:val="false"/>
-          <w:iCs w:val="false"/>
-          <w:sz w:val="20"/>
-          <w:szCs w:val="20"/>
-        </w:rPr>
-        <w:t xml:space="preserve">{#personalRequerido}</w:t>
+        <w:t xml:space="preserve">{#tareas}</w:t>
       </w:r>
     </w:p>
     <w:p>
@@ -4547,6 +4530,79 @@
           <w:sz w:val="20"/>
           <w:szCs w:val="20"/>
         </w:rPr>
+        <w:t xml:space="preserve">{texto}</w:t>
+      </w:r>
+    </w:p>
+    <w:p>
+      <w:pPr>
+        <w:spacing w:after="0" w:before="0"/>
+      </w:pPr>
+      <w:r>
+        <w:rPr>
+          <w:rFonts w:ascii="Arial" w:cs="Arial" w:eastAsia="Arial" w:hAnsi="Arial"/>
+          <w:b w:val="false"/>
+          <w:bCs w:val="false"/>
+          <w:i w:val="false"/>
+          <w:iCs w:val="false"/>
+          <w:sz w:val="20"/>
+          <w:szCs w:val="20"/>
+        </w:rPr>
+        <w:t xml:space="preserve">{/tareas}</w:t>
+      </w:r>
+    </w:p>
+    <w:p>
+      <w:pPr>
+        <w:spacing w:after="0" w:before="0"/>
+      </w:pPr>
+      <w:r>
+        <w:rPr>
+          <w:rFonts w:ascii="Arial" w:cs="Arial" w:eastAsia="Arial" w:hAnsi="Arial"/>
+          <w:b w:val="false"/>
+          <w:bCs w:val="false"/>
+          <w:i w:val="false"/>
+          <w:iCs w:val="false"/>
+          <w:sz w:val="20"/>
+          <w:szCs w:val="20"/>
+        </w:rPr>
+        <w:t xml:space="preserve">{/subItems}</w:t>
+      </w:r>
+    </w:p>
+    <w:p>
+      <w:pPr>
+        <w:spacing w:after="0" w:before="0"/>
+      </w:pPr>
+      <w:r>
+        <w:rPr>
+          <w:rFonts w:ascii="Arial" w:cs="Arial" w:eastAsia="Arial" w:hAnsi="Arial"/>
+          <w:b w:val="false"/>
+          <w:bCs w:val="false"/>
+          <w:i w:val="false"/>
+          <w:iCs w:val="false"/>
+          <w:sz w:val="20"/>
+          <w:szCs w:val="20"/>
+        </w:rPr>
+        <w:t xml:space="preserve">{#personalRequerido}</w:t>
+      </w:r>
+    </w:p>
+    <w:p>
+      <w:pPr>
+        <w:pStyle w:val="ListParagraph"/>
+        <w:numPr>
+          <w:ilvl w:val="0"/>
+          <w:numId w:val="2"/>
+        </w:numPr>
+        <w:spacing w:after="120" w:before="0"/>
+      </w:pPr>
+      <w:r>
+        <w:rPr>
+          <w:rFonts w:ascii="Arial" w:cs="Arial" w:eastAsia="Arial" w:hAnsi="Arial"/>
+          <w:b w:val="false"/>
+          <w:bCs w:val="false"/>
+          <w:i w:val="false"/>
+          <w:iCs w:val="false"/>
+          <w:sz w:val="20"/>
+          <w:szCs w:val="20"/>
+        </w:rPr>
         <w:t xml:space="preserve">{cantidad} {cargo}</w:t>
       </w:r>
     </w:p>
@@ -4723,6 +4779,58 @@
           <w:szCs w:val="20"/>
         </w:rPr>
         <w:t xml:space="preserve">13.1. Histograma de equipo de trabajo</w:t>
+      </w:r>
+    </w:p>
+    <w:p>
+      <w:pPr>
+        <w:spacing w:after="0" w:before="0"/>
+      </w:pPr>
+      <w:r>
+        <w:rPr>
+          <w:rFonts w:ascii="Arial" w:cs="Arial" w:eastAsia="Arial" w:hAnsi="Arial"/>
+          <w:b w:val="false"/>
+          <w:bCs w:val="false"/>
+          <w:i w:val="false"/>
+          <w:iCs w:val="false"/>
+          <w:sz w:val="20"/>
+          <w:szCs w:val="20"/>
+        </w:rPr>
+        <w:t xml:space="preserve">{#tieneHistogramaEquipoPng}</w:t>
+      </w:r>
+    </w:p>
+    <w:p>
+      <w:pPr>
+        <w:spacing w:after="120" w:before="0"/>
+        <w:jc w:val="center"/>
+      </w:pPr>
+      <w:r>
+        <w:rPr>
+          <w:rFonts w:ascii="Arial" w:cs="Arial" w:eastAsia="Arial" w:hAnsi="Arial"/>
+          <w:b w:val="false"/>
+          <w:bCs w:val="false"/>
+          <w:i w:val="false"/>
+          <w:iCs w:val="false"/>
+          <w:sz w:val="20"/>
+          <w:szCs w:val="20"/>
+        </w:rPr>
+        <w:t xml:space="preserve">{%histogramaEquipoPng}</w:t>
+      </w:r>
+    </w:p>
+    <w:p>
+      <w:pPr>
+        <w:spacing w:after="0" w:before="0"/>
+      </w:pPr>
+      <w:r>
+        <w:rPr>
+          <w:rFonts w:ascii="Arial" w:cs="Arial" w:eastAsia="Arial" w:hAnsi="Arial"/>
+          <w:b w:val="false"/>
+          <w:bCs w:val="false"/>
+          <w:i w:val="false"/>
+          <w:iCs w:val="false"/>
+          <w:sz w:val="20"/>
+          <w:szCs w:val="20"/>
+        </w:rPr>
+        <w:t xml:space="preserve">{/tieneHistogramaEquipoPng}</w:t>
       </w:r>
     </w:p>
     <w:tbl>
@@ -4944,6 +5052,58 @@
           <w:szCs w:val="20"/>
         </w:rPr>
         <w:t xml:space="preserve">13.2. Histograma de horas hombre</w:t>
+      </w:r>
+    </w:p>
+    <w:p>
+      <w:pPr>
+        <w:spacing w:after="0" w:before="0"/>
+      </w:pPr>
+      <w:r>
+        <w:rPr>
+          <w:rFonts w:ascii="Arial" w:cs="Arial" w:eastAsia="Arial" w:hAnsi="Arial"/>
+          <w:b w:val="false"/>
+          <w:bCs w:val="false"/>
+          <w:i w:val="false"/>
+          <w:iCs w:val="false"/>
+          <w:sz w:val="20"/>
+          <w:szCs w:val="20"/>
+        </w:rPr>
+        <w:t xml:space="preserve">{#tieneHistogramaHHPng}</w:t>
+      </w:r>
+    </w:p>
+    <w:p>
+      <w:pPr>
+        <w:spacing w:after="120" w:before="0"/>
+        <w:jc w:val="center"/>
+      </w:pPr>
+      <w:r>
+        <w:rPr>
+          <w:rFonts w:ascii="Arial" w:cs="Arial" w:eastAsia="Arial" w:hAnsi="Arial"/>
+          <w:b w:val="false"/>
+          <w:bCs w:val="false"/>
+          <w:i w:val="false"/>
+          <w:iCs w:val="false"/>
+          <w:sz w:val="20"/>
+          <w:szCs w:val="20"/>
+        </w:rPr>
+        <w:t xml:space="preserve">{%histogramaHHPng}</w:t>
+      </w:r>
+    </w:p>
+    <w:p>
+      <w:pPr>
+        <w:spacing w:after="0" w:before="0"/>
+      </w:pPr>
+      <w:r>
+        <w:rPr>
+          <w:rFonts w:ascii="Arial" w:cs="Arial" w:eastAsia="Arial" w:hAnsi="Arial"/>
+          <w:b w:val="false"/>
+          <w:bCs w:val="false"/>
+          <w:i w:val="false"/>
+          <w:iCs w:val="false"/>
+          <w:sz w:val="20"/>
+          <w:szCs w:val="20"/>
+        </w:rPr>
+        <w:t xml:space="preserve">{/tieneHistogramaHHPng}</w:t>
       </w:r>
     </w:p>
     <w:tbl>

</xml_diff>

<commit_message>
chore(plan-trabajo): reemplazar plantilla docx (nueva version del usuario)
Co-Authored-By: Claude Sonnet 5 <noreply@anthropic.com>
</commit_message>
<xml_diff>
--- a/src/lib/services/planTrabajo/templates/plan-trabajo-nexa-template.docx
+++ b/src/lib/services/planTrabajo/templates/plan-trabajo-nexa-template.docx
@@ -4618,6 +4618,76 @@
           <w:szCs w:val="20"/>
         </w:rPr>
         <w:t xml:space="preserve">{/tareas}</w:t>
+      </w:r>
+    </w:p>
+    <w:p>
+      <w:pPr>
+        <w:spacing w:after="0" w:before="0"/>
+      </w:pPr>
+      <w:r>
+        <w:rPr>
+          <w:rFonts w:ascii="Arial" w:cs="Arial" w:eastAsia="Arial" w:hAnsi="Arial"/>
+          <w:b w:val="false"/>
+          <w:bCs w:val="false"/>
+          <w:i w:val="false"/>
+          <w:iCs w:val="false"/>
+          <w:sz w:val="20"/>
+          <w:szCs w:val="20"/>
+        </w:rPr>
+        <w:t xml:space="preserve">{#imagenesSubItem}</w:t>
+      </w:r>
+    </w:p>
+    <w:p>
+      <w:pPr>
+        <w:spacing w:after="120" w:before="0"/>
+        <w:jc w:val="center"/>
+      </w:pPr>
+      <w:r>
+        <w:rPr>
+          <w:rFonts w:ascii="Arial" w:cs="Arial" w:eastAsia="Arial" w:hAnsi="Arial"/>
+          <w:b w:val="false"/>
+          <w:bCs w:val="false"/>
+          <w:i w:val="false"/>
+          <w:iCs w:val="false"/>
+          <w:sz w:val="20"/>
+          <w:szCs w:val="20"/>
+        </w:rPr>
+        <w:t xml:space="preserve">{%img}</w:t>
+      </w:r>
+    </w:p>
+    <w:p>
+      <w:pPr>
+        <w:spacing w:after="120" w:before="0"/>
+        <w:jc w:val="center"/>
+      </w:pPr>
+      <w:r>
+        <w:rPr>
+          <w:rFonts w:ascii="Arial" w:cs="Arial" w:eastAsia="Arial" w:hAnsi="Arial"/>
+          <w:b w:val="false"/>
+          <w:bCs w:val="false"/>
+          <w:i/>
+          <w:iCs/>
+          <w:sz w:val="18"/>
+          <w:szCs w:val="18"/>
+        </w:rPr>
+        <w:t xml:space="preserve">{caption}</w:t>
+      </w:r>
+    </w:p>
+    <w:p>
+      <w:pPr>
+        <w:spacing w:after="0" w:before="0"/>
+      </w:pPr>
+      <w:r>
+        <w:rPr>
+          <w:rFonts w:ascii="Arial" w:cs="Arial" w:eastAsia="Arial" w:hAnsi="Arial"/>
+          <w:b w:val="false"/>
+          <w:bCs w:val="false"/>
+          <w:i w:val="false"/>
+          <w:iCs w:val="false"/>
+          <w:sz w:val="20"/>
+          <w:szCs w:val="20"/>
+        </w:rPr>
+        <w:t xml:space="preserve">{/imagenesSubItem}</w:t>
       </w:r>
     </w:p>
     <w:p>

</xml_diff>

<commit_message>
fix(plan-trabajo): actualizar plantilla docx de Nexa
Correcciones de plantilla aplicadas manualmente en Word.

Co-Authored-By: Claude Sonnet 5 <noreply@anthropic.com>
</commit_message>
<xml_diff>
--- a/src/lib/services/planTrabajo/templates/plan-trabajo-nexa-template.docx
+++ b/src/lib/services/planTrabajo/templates/plan-trabajo-nexa-template.docx
@@ -926,24 +926,6 @@
       </w:sdtContent>
     </w:sdt>
     <w:p>
-      <w:pPr>
-        <w:spacing w:after="0" w:before="0"/>
-      </w:pPr>
-      <w:r>
-        <w:rPr>
-          <w:rFonts w:ascii="Arial" w:cs="Arial" w:eastAsia="Arial" w:hAnsi="Arial"/>
-          <w:b w:val="false"/>
-          <w:bCs w:val="false"/>
-          <w:i/>
-          <w:iCs/>
-          <w:color w:val="808080"/>
-          <w:sz w:val="16"/>
-          <w:szCs w:val="16"/>
-        </w:rPr>
-        <w:t xml:space="preserve">(Actualizar índice en Word: Ctrl+E y luego F9)</w:t>
-      </w:r>
-    </w:p>
-    <w:p>
       <w:r>
         <w:br w:type="page"/>
       </w:r>
@@ -1143,6 +1125,23 @@
     </w:p>
     <w:p>
       <w:pPr>
+        <w:spacing w:after="0" w:before="0"/>
+      </w:pPr>
+      <w:r>
+        <w:rPr>
+          <w:rFonts w:ascii="Arial" w:cs="Arial" w:eastAsia="Arial" w:hAnsi="Arial"/>
+          <w:b w:val="false"/>
+          <w:bCs w:val="false"/>
+          <w:i w:val="false"/>
+          <w:iCs w:val="false"/>
+          <w:sz w:val="20"/>
+          <w:szCs w:val="20"/>
+        </w:rPr>
+        <w:t xml:space="preserve">{#referencias}</w:t>
+      </w:r>
+    </w:p>
+    <w:p>
+      <w:pPr>
         <w:pStyle w:val="ListParagraph"/>
         <w:numPr>
           <w:ilvl w:val="0"/>
@@ -1160,7 +1159,7 @@
           <w:sz w:val="20"/>
           <w:szCs w:val="20"/>
         </w:rPr>
-        <w:t xml:space="preserve">{#referencias}{codigo} — {descripcion}</w:t>
+        <w:t xml:space="preserve">{codigo} — {descripcion}</w:t>
       </w:r>
     </w:p>
     <w:p>
@@ -1540,6 +1539,23 @@
     </w:p>
     <w:p>
       <w:pPr>
+        <w:spacing w:after="0" w:before="0"/>
+      </w:pPr>
+      <w:r>
+        <w:rPr>
+          <w:rFonts w:ascii="Arial" w:cs="Arial" w:eastAsia="Arial" w:hAnsi="Arial"/>
+          <w:b w:val="false"/>
+          <w:bCs w:val="false"/>
+          <w:i w:val="false"/>
+          <w:iCs w:val="false"/>
+          <w:sz w:val="20"/>
+          <w:szCs w:val="20"/>
+        </w:rPr>
+        <w:t xml:space="preserve">{#definicionesEspecificas}</w:t>
+      </w:r>
+    </w:p>
+    <w:p>
+      <w:pPr>
         <w:pStyle w:val="ListParagraph"/>
         <w:numPr>
           <w:ilvl w:val="0"/>
@@ -1557,7 +1573,7 @@
           <w:sz w:val="20"/>
           <w:szCs w:val="20"/>
         </w:rPr>
-        <w:t xml:space="preserve">{#definicionesEspecificas}{termino}: </w:t>
+        <w:t xml:space="preserve">{termino}: </w:t>
       </w:r>
       <w:r>
         <w:rPr>
@@ -4248,6 +4264,23 @@
     </w:p>
     <w:p>
       <w:pPr>
+        <w:spacing w:after="0" w:before="0"/>
+      </w:pPr>
+      <w:r>
+        <w:rPr>
+          <w:rFonts w:ascii="Arial" w:cs="Arial" w:eastAsia="Arial" w:hAnsi="Arial"/>
+          <w:b w:val="false"/>
+          <w:bCs w:val="false"/>
+          <w:i w:val="false"/>
+          <w:iCs w:val="false"/>
+          <w:sz w:val="20"/>
+          <w:szCs w:val="20"/>
+        </w:rPr>
+        <w:t xml:space="preserve">{#restricciones}</w:t>
+      </w:r>
+    </w:p>
+    <w:p>
+      <w:pPr>
         <w:pStyle w:val="ListParagraph"/>
         <w:numPr>
           <w:ilvl w:val="0"/>
@@ -4255,18 +4288,6 @@
         </w:numPr>
         <w:spacing w:after="120" w:before="0"/>
       </w:pPr>
-      <w:r>
-        <w:rPr>
-          <w:rFonts w:ascii="Arial" w:cs="Arial" w:eastAsia="Arial" w:hAnsi="Arial"/>
-          <w:b/>
-          <w:bCs/>
-          <w:i w:val="false"/>
-          <w:iCs w:val="false"/>
-          <w:sz w:val="20"/>
-          <w:szCs w:val="20"/>
-        </w:rPr>
-        <w:t xml:space="preserve">{#restricciones}[{categoria}] </w:t>
-      </w:r>
       <w:r>
         <w:rPr>
           <w:rFonts w:ascii="Arial" w:cs="Arial" w:eastAsia="Arial" w:hAnsi="Arial"/>

</xml_diff>

<commit_message>
fix(plan-trabajo): actualizar plantilla docx de Nexa y su README
Correcciones de plantilla aplicadas manualmente en Word.

Co-Authored-By: Claude Sonnet 5 <noreply@anthropic.com>
</commit_message>
<xml_diff>
--- a/src/lib/services/planTrabajo/templates/plan-trabajo-nexa-template.docx
+++ b/src/lib/services/planTrabajo/templates/plan-trabajo-nexa-template.docx
@@ -6288,17 +6288,41 @@
             <w:jc w:val="center"/>
           </w:pPr>
           <w:r>
-            <w:rPr>
-              <w:rFonts w:ascii="Arial" w:cs="Arial" w:eastAsia="Arial" w:hAnsi="Arial"/>
-              <w:b/>
-              <w:bCs/>
-              <w:i w:val="false"/>
-              <w:iCs w:val="false"/>
-              <w:color w:val="ED7D31"/>
-              <w:sz w:val="22"/>
-              <w:szCs w:val="22"/>
-            </w:rPr>
-            <w:t xml:space="preserve">GYS CONTROL INDUSTRIAL SAC</w:t>
+            <w:drawing>
+              <wp:inline distT="0" distB="0" distL="0" distR="0">
+                <wp:extent cx="1000919" cy="247650"/>
+                <wp:effectExtent l="0" t="0" r="0" b="0"/>
+                <wp:docPr id="1" name="nexa_logo.png" descr="Logo Nexa Resources"/>
+                <wp:cNvGraphicFramePr/>
+                <a:graphic xmlns:a="http://schemas.openxmlformats.org/drawingml/2006/main">
+                  <a:graphicData uri="http://schemas.openxmlformats.org/drawingml/2006/picture">
+                    <pic:pic xmlns:pic="http://schemas.openxmlformats.org/drawingml/2006/picture">
+                      <pic:nvPicPr>
+                        <pic:cNvPr id="0" name="nexa_logo.png" descr="Logo Nexa Resources"/>
+                        <pic:cNvPicPr preferRelativeResize="0"/>
+                      </pic:nvPicPr>
+                      <pic:blipFill>
+                        <a:blip r:embed="rId1"/>
+                        <a:srcRect/>
+                        <a:stretch>
+                          <a:fillRect/>
+                        </a:stretch>
+                      </pic:blipFill>
+                      <pic:spPr>
+                        <a:xfrm>
+                          <a:off x="0" y="0"/>
+                          <a:ext cx="1000919" cy="247650"/>
+                        </a:xfrm>
+                        <a:prstGeom prst="rect">
+                          <a:avLst/>
+                        </a:prstGeom>
+                        <a:ln/>
+                      </pic:spPr>
+                    </pic:pic>
+                  </a:graphicData>
+                </a:graphic>
+              </wp:inline>
+            </w:drawing>
           </w:r>
         </w:p>
       </w:tc>

</xml_diff>

<commit_message>
fix(plan-trabajo): plantilla con seccion 13.3 (version correcta, 21232 bytes)
</commit_message>
<xml_diff>
--- a/src/lib/services/planTrabajo/templates/plan-trabajo-nexa-template.docx
+++ b/src/lib/services/planTrabajo/templates/plan-trabajo-nexa-template.docx
@@ -5671,6 +5671,76 @@
         </w:tc>
       </w:tr>
     </w:tbl>
+    <w:p>
+      <w:pPr>
+        <w:spacing w:after="0" w:before="0"/>
+      </w:pPr>
+      <w:r>
+        <w:rPr>
+          <w:rFonts w:ascii="Arial" w:cs="Arial" w:eastAsia="Arial" w:hAnsi="Arial"/>
+          <w:b w:val="false"/>
+          <w:bCs w:val="false"/>
+          <w:i w:val="false"/>
+          <w:iCs w:val="false"/>
+          <w:sz w:val="20"/>
+          <w:szCs w:val="20"/>
+        </w:rPr>
+        <w:t xml:space="preserve">{#tieneHistogramaHHActividadPng}</w:t>
+      </w:r>
+    </w:p>
+    <w:p>
+      <w:pPr>
+        <w:pStyle w:val="Heading2"/>
+        <w:spacing w:after="100" w:before="200"/>
+      </w:pPr>
+      <w:r>
+        <w:rPr>
+          <w:rFonts w:ascii="Arial" w:cs="Arial" w:eastAsia="Arial" w:hAnsi="Arial"/>
+          <w:b/>
+          <w:bCs/>
+          <w:i w:val="false"/>
+          <w:iCs w:val="false"/>
+          <w:sz w:val="20"/>
+          <w:szCs w:val="20"/>
+        </w:rPr>
+        <w:t xml:space="preserve">13.3. Horas hombre por actividad (Construcción y Comisionamiento)</w:t>
+      </w:r>
+    </w:p>
+    <w:p>
+      <w:pPr>
+        <w:spacing w:after="120" w:before="0"/>
+        <w:jc w:val="center"/>
+      </w:pPr>
+      <w:r>
+        <w:rPr>
+          <w:rFonts w:ascii="Arial" w:cs="Arial" w:eastAsia="Arial" w:hAnsi="Arial"/>
+          <w:b w:val="false"/>
+          <w:bCs w:val="false"/>
+          <w:i w:val="false"/>
+          <w:iCs w:val="false"/>
+          <w:sz w:val="20"/>
+          <w:szCs w:val="20"/>
+        </w:rPr>
+        <w:t xml:space="preserve">{%histogramaHHActividadPng}</w:t>
+      </w:r>
+    </w:p>
+    <w:p>
+      <w:pPr>
+        <w:spacing w:after="0" w:before="0"/>
+      </w:pPr>
+      <w:r>
+        <w:rPr>
+          <w:rFonts w:ascii="Arial" w:cs="Arial" w:eastAsia="Arial" w:hAnsi="Arial"/>
+          <w:b w:val="false"/>
+          <w:bCs w:val="false"/>
+          <w:i w:val="false"/>
+          <w:iCs w:val="false"/>
+          <w:sz w:val="20"/>
+          <w:szCs w:val="20"/>
+        </w:rPr>
+        <w:t xml:space="preserve">{/tieneHistogramaHHActividadPng}</w:t>
+      </w:r>
+    </w:p>
     <w:p>
       <w:pPr>
         <w:pStyle w:val="Heading1"/>

</xml_diff>